<commit_message>
docs(methods): align Methods with the promoted main branch
The recheck lineage is now main (rustyclean e6b931f), so the Methods text
is corrected against the shipped implementation:

- --bowtie2-recheck is opt-in, not automatic. Auto mode passes the flag
  through unchanged; the CLI help text still claims it is enabled at high
  host fractions, which the implementation does not do.
- Auto routing requires both a high host fraction and a minimum read count
  (default 20M), because loading the Kraken2 database is a fixed cost.
- Implementation figures updated: ~3,100 lines across nine modules, five
  selectable depletion backends.
- Stage names corrected to match the PipelineStage enum.

Also adds the status deck and its generator.
</commit_message>
<xml_diff>
--- a/manuscript/RustyClean_Manuscript_Draft.docx
+++ b/manuscript/RustyClean_Manuscript_Draft.docx
@@ -1040,28 +1040,7 @@
         <w:pStyle w:val="FirstParagraph"/>
       </w:pPr>
       <w:r>
-        <w:t xml:space="preserve">Alignment verification (</w:t>
-      </w:r>
-      <w:r>
-        <w:rPr>
-          <w:rStyle w:val="VerbatimChar"/>
-        </w:rPr>
-        <w:t xml:space="preserve">--bowtie2-recheck</w:t>
-      </w:r>
-      <w:r>
-        <w:t xml:space="preserve">) is enabled by default when</w:t>
-      </w:r>
-      <w:r>
-        <w:t xml:space="preserve"> </w:t>
-      </w:r>
-      <w:r>
-        <w:t xml:space="preserve">auto mode routes a sample to the Kraken2 classification path. It can be</w:t>
-      </w:r>
-      <w:r>
-        <w:t xml:space="preserve"> </w:t>
-      </w:r>
-      <w:r>
-        <w:t xml:space="preserve">disabled for users who prefer raw Kraken2 output.</w:t>
+        <w:t>Alignment verification (--bowtie2-recheck) applies only on the Kraken2 classification path and is opt-in: the flag defaults to off and auto mode passes it through unchanged. All classification-path results reported here were produced with the flag set. Note that the CLI help text still describes it as automatic at high host fractions; the implementation does not do this, and the two will be reconciled.</w:t>
       </w:r>
     </w:p>
     <w:p>
@@ -1339,25 +1318,7 @@
         </w:numPr>
       </w:pPr>
       <w:r>
-        <w:t xml:space="preserve">ĥ &gt; ĥ_high (default 30%) and N is large (default &gt; 20 M reads) →</w:t>
-      </w:r>
-      <w:r>
-        <w:t xml:space="preserve"> </w:t>
-      </w:r>
-      <w:r>
-        <w:t xml:space="preserve">classification path (Section 2.4) with Bowtie2 recheck (Section 2.6).</w:t>
-      </w:r>
-      <w:r>
-        <w:t xml:space="preserve"> </w:t>
-      </w:r>
-      <w:r>
-        <w:t xml:space="preserve">Kraken2 removes the host majority rapidly, and the recheck pass</w:t>
-      </w:r>
-      <w:r>
-        <w:t xml:space="preserve"> </w:t>
-      </w:r>
-      <w:r>
-        <w:t xml:space="preserve">re-screens the smaller retained set to recover missed host reads.</w:t>
+        <w:t>ĥ &gt; ĥ_high (default 30%) and N &gt; N_min (default 20 million reads) → classification path (Section 2.4). Kraken2 removes the host majority rapidly; the verification pass of Section 2.6 is applied on top when --bowtie2-recheck is set. The read-count condition is required because loading the Kraken2 database is a fixed cost that only pays off once the library is large enough to amortise it.</w:t>
       </w:r>
     </w:p>
     <w:p>
@@ -2040,149 +2001,7 @@
         <w:pStyle w:val="FirstParagraph"/>
       </w:pPr>
       <w:r>
-        <w:rPr>
-          <w:b/>
-          <w:bCs/>
-        </w:rPr>
-        <w:t xml:space="preserve">Stage machine.</w:t>
-      </w:r>
-      <w:r>
-        <w:t xml:space="preserve"> </w:t>
-      </w:r>
-      <w:r>
-        <w:t xml:space="preserve">Each sample's progress is represented as a totally</w:t>
-      </w:r>
-      <w:r>
-        <w:t xml:space="preserve"> </w:t>
-      </w:r>
-      <w:r>
-        <w:t xml:space="preserve">ordered enumeration of stages (</w:t>
-      </w:r>
-      <w:r>
-        <w:rPr>
-          <w:rStyle w:val="VerbatimChar"/>
-        </w:rPr>
-        <w:t xml:space="preserve">Pending</w:t>
-      </w:r>
-      <w:r>
-        <w:t xml:space="preserve"> </w:t>
-      </w:r>
-      <w:r>
-        <w:t xml:space="preserve">→</w:t>
-      </w:r>
-      <w:r>
-        <w:t xml:space="preserve"> </w:t>
-      </w:r>
-      <w:r>
-        <w:rPr>
-          <w:rStyle w:val="VerbatimChar"/>
-        </w:rPr>
-        <w:t xml:space="preserve">FastpRunning</w:t>
-      </w:r>
-      <w:r>
-        <w:t xml:space="preserve"> </w:t>
-      </w:r>
-      <w:r>
-        <w:t xml:space="preserve">→</w:t>
-      </w:r>
-      <w:r>
-        <w:t xml:space="preserve"> </w:t>
-      </w:r>
-      <w:r>
-        <w:rPr>
-          <w:rStyle w:val="VerbatimChar"/>
-        </w:rPr>
-        <w:t xml:space="preserve">FastpComplete</w:t>
-      </w:r>
-      <w:r>
-        <w:t xml:space="preserve"> </w:t>
-      </w:r>
-      <w:r>
-        <w:t xml:space="preserve">→</w:t>
-      </w:r>
-      <w:r>
-        <w:t xml:space="preserve"> </w:t>
-      </w:r>
-      <w:r>
-        <w:rPr>
-          <w:rStyle w:val="VerbatimChar"/>
-        </w:rPr>
-        <w:t xml:space="preserve">DepletionRunning</w:t>
-      </w:r>
-      <w:r>
-        <w:t xml:space="preserve"> </w:t>
-      </w:r>
-      <w:r>
-        <w:t xml:space="preserve">→</w:t>
-      </w:r>
-      <w:r>
-        <w:t xml:space="preserve"> </w:t>
-      </w:r>
-      <w:r>
-        <w:rPr>
-          <w:rStyle w:val="VerbatimChar"/>
-        </w:rPr>
-        <w:t xml:space="preserve">DepletionComplete</w:t>
-      </w:r>
-      <w:r>
-        <w:t xml:space="preserve"> </w:t>
-      </w:r>
-      <w:r>
-        <w:t xml:space="preserve">→</w:t>
-      </w:r>
-      <w:r>
-        <w:t xml:space="preserve"> </w:t>
-      </w:r>
-      <w:r>
-        <w:rPr>
-          <w:rStyle w:val="VerbatimChar"/>
-        </w:rPr>
-        <w:t xml:space="preserve">Validating</w:t>
-      </w:r>
-      <w:r>
-        <w:t xml:space="preserve"> </w:t>
-      </w:r>
-      <w:r>
-        <w:t xml:space="preserve">→</w:t>
-      </w:r>
-      <w:r>
-        <w:t xml:space="preserve"> </w:t>
-      </w:r>
-      <w:r>
-        <w:rPr>
-          <w:rStyle w:val="VerbatimChar"/>
-        </w:rPr>
-        <w:t xml:space="preserve">Completed</w:t>
-      </w:r>
-      <w:r>
-        <w:t xml:space="preserve">/</w:t>
-      </w:r>
-      <w:r>
-        <w:rPr>
-          <w:rStyle w:val="VerbatimChar"/>
-        </w:rPr>
-        <w:t xml:space="preserve">Failed</w:t>
-      </w:r>
-      <w:r>
-        <w:t xml:space="preserve">). Because the stages are ordered,</w:t>
-      </w:r>
-      <w:r>
-        <w:t xml:space="preserve"> </w:t>
-      </w:r>
-      <w:r>
-        <w:t xml:space="preserve">resumption reduces to a comparison rather than per-stage branching</w:t>
-      </w:r>
-      <w:r>
-        <w:t xml:space="preserve"> </w:t>
-      </w:r>
-      <w:r>
-        <w:t xml:space="preserve">logic, and a resumed sample re-executes only the stages after its</w:t>
-      </w:r>
-      <w:r>
-        <w:t xml:space="preserve"> </w:t>
-      </w:r>
-      <w:r>
-        <w:t xml:space="preserve">recorded position.</w:t>
+        <w:t>Stage machine. Each sample's progress is represented as a totally ordered enumeration of stages (Pending → FastpRunning → FastpComplete → Kraken2Running → Kraken2Complete → Validating → Completed / Failed). Because the stages are ordered, resumption reduces to a comparison rather than per-stage branching logic, and a resumed sample re-executes only the stages after its recorded position. The two depletion stages are named after Kraken2 for historical reasons but are used by every backend.</w:t>
       </w:r>
     </w:p>
     <w:p>
@@ -2429,52 +2248,7 @@
         <w:pStyle w:val="BodyText"/>
       </w:pPr>
       <w:r>
-        <w:rPr>
-          <w:b/>
-          <w:bCs/>
-        </w:rPr>
-        <w:t xml:space="preserve">Implementation.</w:t>
-      </w:r>
-      <w:r>
-        <w:t xml:space="preserve"> </w:t>
-      </w:r>
-      <w:r>
-        <w:t xml:space="preserve">RustyClean is ~1,300 lines of Rust built on the</w:t>
-      </w:r>
-      <w:r>
-        <w:t xml:space="preserve"> </w:t>
-      </w:r>
-      <w:r>
-        <w:t xml:space="preserve">Tokio asynchronous runtime, distributed as a single binary with no</w:t>
-      </w:r>
-      <w:r>
-        <w:t xml:space="preserve"> </w:t>
-      </w:r>
-      <w:r>
-        <w:t xml:space="preserve">language runtime dependency. External dependencies are the fastp,</w:t>
-      </w:r>
-      <w:r>
-        <w:t xml:space="preserve"> </w:t>
-      </w:r>
-      <w:r>
-        <w:t xml:space="preserve">Kraken2, and Bowtie2 executables. Source is available at</w:t>
-      </w:r>
-      <w:r>
-        <w:t xml:space="preserve"> </w:t>
-      </w:r>
-      <w:hyperlink r:id="rId9">
-        <w:r>
-          <w:rPr>
-            <w:rStyle w:val="Hyperlink"/>
-          </w:rPr>
-          <w:t xml:space="preserve">https://github.com/HuangShiLab/rustyclean</w:t>
-        </w:r>
-      </w:hyperlink>
-      <w:r>
-        <w:t xml:space="preserve"> </w:t>
-      </w:r>
-      <w:r>
-        <w:t xml:space="preserve">under the MIT licence.</w:t>
+        <w:t>Implementation. RustyClean is approximately 3,100 lines of Rust across nine modules, built on the Tokio asynchronous runtime and distributed as a single binary with no language runtime dependency. Five depletion backends are selectable with --host-removal-mode (kraken2, bowtie2, minimap2, sylph, centrifuge) in addition to auto; external dependencies are the executables for whichever backends are used, plus fastp and seqtk. Source is available at https://github.com/HuangShiLab/rustyclean under the MIT licence.</w:t>
       </w:r>
     </w:p>
     <w:bookmarkEnd w:id="20"/>

</xml_diff>